<commit_message>
Typeset the formulas as Word equations instead of plain text
Word stores equations as OMML, not LaTeX, and docx-js can emit it directly, so
the six formulas in section 2 are now real equation objects — proper subscripts,
a real fraction bar, and editable in Word's equation editor — rather than the
ASCII approximations they were.

Note the import needs aliasing: docx exports a class called Math, which shadows
the global Math and breaks every Math.round in the file.
</commit_message>
<xml_diff>
--- a/docs/设计报告.docx
+++ b/docs/设计报告.docx
@@ -1140,31 +1140,163 @@
     </w:p>
     <w:p>
       <w:pPr>
-        <w:spacing w:after="0" w:before="60" w:line="240" w:lineRule="exact"/>
-        <w:ind w:left="240"/>
-      </w:pPr>
-      <w:r>
-        <w:rPr>
-          <w:rFonts w:ascii="Consolas" w:eastAsia="SimSun" w:hAnsi="Consolas"/>
-          <w:sz w:val="18"/>
-          <w:szCs w:val="18"/>
-        </w:rPr>
-        <w:t xml:space="preserve">μ(k) = μ(k-1) + α · [ x(k) - μ(k-1) ]</w:t>
-      </w:r>
-    </w:p>
-    <w:p>
-      <w:pPr>
-        <w:spacing w:after="60" w:before="0" w:line="240" w:lineRule="exact"/>
-        <w:ind w:left="240"/>
-      </w:pPr>
-      <w:r>
-        <w:rPr>
-          <w:rFonts w:ascii="Consolas" w:eastAsia="SimSun" w:hAnsi="Consolas"/>
-          <w:sz w:val="18"/>
-          <w:szCs w:val="18"/>
-        </w:rPr>
-        <w:t xml:space="preserve">σ(k) = σ(k-1) + β · [ |x(k) - μ(k-1)| - σ(k-1) ]</w:t>
-      </w:r>
+        <w:spacing w:after="60" w:before="60" w:line="440" w:lineRule="exact"/>
+        <w:jc w:val="center"/>
+      </w:pPr>
+      <m:oMath>
+        <m:sSub>
+          <m:sSubPr/>
+          <m:e>
+            <m:r>
+              <m:t>μ</m:t>
+            </m:r>
+          </m:e>
+          <m:sub>
+            <m:r>
+              <m:t>k</m:t>
+            </m:r>
+          </m:sub>
+        </m:sSub>
+        <m:r>
+          <m:t> = </m:t>
+        </m:r>
+        <m:sSub>
+          <m:sSubPr/>
+          <m:e>
+            <m:r>
+              <m:t>μ</m:t>
+            </m:r>
+          </m:e>
+          <m:sub>
+            <m:r>
+              <m:t>k−1</m:t>
+            </m:r>
+          </m:sub>
+        </m:sSub>
+        <m:r>
+          <m:t> + α(</m:t>
+        </m:r>
+        <m:sSub>
+          <m:sSubPr/>
+          <m:e>
+            <m:r>
+              <m:t>x</m:t>
+            </m:r>
+          </m:e>
+          <m:sub>
+            <m:r>
+              <m:t>k</m:t>
+            </m:r>
+          </m:sub>
+        </m:sSub>
+        <m:r>
+          <m:t> − </m:t>
+        </m:r>
+        <m:sSub>
+          <m:sSubPr/>
+          <m:e>
+            <m:r>
+              <m:t>μ</m:t>
+            </m:r>
+          </m:e>
+          <m:sub>
+            <m:r>
+              <m:t>k−1</m:t>
+            </m:r>
+          </m:sub>
+        </m:sSub>
+        <m:r>
+          <m:t>)</m:t>
+        </m:r>
+      </m:oMath>
+    </w:p>
+    <w:p>
+      <w:pPr>
+        <w:spacing w:after="60" w:before="60" w:line="440" w:lineRule="exact"/>
+        <w:jc w:val="center"/>
+      </w:pPr>
+      <m:oMath>
+        <m:sSub>
+          <m:sSubPr/>
+          <m:e>
+            <m:r>
+              <m:t>σ</m:t>
+            </m:r>
+          </m:e>
+          <m:sub>
+            <m:r>
+              <m:t>k</m:t>
+            </m:r>
+          </m:sub>
+        </m:sSub>
+        <m:r>
+          <m:t> = </m:t>
+        </m:r>
+        <m:sSub>
+          <m:sSubPr/>
+          <m:e>
+            <m:r>
+              <m:t>σ</m:t>
+            </m:r>
+          </m:e>
+          <m:sub>
+            <m:r>
+              <m:t>k−1</m:t>
+            </m:r>
+          </m:sub>
+        </m:sSub>
+        <m:r>
+          <m:t> + β(|</m:t>
+        </m:r>
+        <m:sSub>
+          <m:sSubPr/>
+          <m:e>
+            <m:r>
+              <m:t>x</m:t>
+            </m:r>
+          </m:e>
+          <m:sub>
+            <m:r>
+              <m:t>k</m:t>
+            </m:r>
+          </m:sub>
+        </m:sSub>
+        <m:r>
+          <m:t> − </m:t>
+        </m:r>
+        <m:sSub>
+          <m:sSubPr/>
+          <m:e>
+            <m:r>
+              <m:t>μ</m:t>
+            </m:r>
+          </m:e>
+          <m:sub>
+            <m:r>
+              <m:t>k−1</m:t>
+            </m:r>
+          </m:sub>
+        </m:sSub>
+        <m:r>
+          <m:t>| − </m:t>
+        </m:r>
+        <m:sSub>
+          <m:sSubPr/>
+          <m:e>
+            <m:r>
+              <m:t>σ</m:t>
+            </m:r>
+          </m:e>
+          <m:sub>
+            <m:r>
+              <m:t>k−1</m:t>
+            </m:r>
+          </m:sub>
+        </m:sSub>
+        <m:r>
+          <m:t>)</m:t>
+        </m:r>
+      </m:oMath>
     </w:p>
     <w:p>
       <w:pPr>
@@ -1182,30 +1314,107 @@
     </w:p>
     <w:p>
       <w:pPr>
-        <w:spacing w:after="0" w:before="60" w:line="240" w:lineRule="exact"/>
-        <w:ind w:left="240"/>
-      </w:pPr>
-      <w:r>
-        <w:rPr>
-          <w:rFonts w:ascii="Consolas" w:eastAsia="SimSun" w:hAnsi="Consolas"/>
-          <w:sz w:val="18"/>
-          <w:szCs w:val="18"/>
-        </w:rPr>
-        <w:t xml:space="preserve">[ μ - w , μ + w ] ,   w = clamp( 3σ , w_min , w_max )</w:t>
-      </w:r>
-    </w:p>
-    <w:p>
-      <w:pPr>
-        <w:spacing w:after="60" w:before="0" w:line="240" w:lineRule="exact"/>
-        <w:ind w:left="240"/>
-      </w:pPr>
-      <w:r>
-        <w:rPr>
-          <w:rFonts w:ascii="Consolas" w:eastAsia="SimSun" w:hAnsi="Consolas"/>
-          <w:sz w:val="18"/>
-          <w:szCs w:val="18"/>
-        </w:rPr>
-        <w:t xml:space="preserve">温度  w ∈ [1.5, 5.0] °C     湿度  w ∈ [5, 15] %RH</w:t>
+        <w:spacing w:after="60" w:before="60" w:line="440" w:lineRule="exact"/>
+        <w:jc w:val="center"/>
+      </w:pPr>
+      <m:oMath>
+        <m:r>
+          <m:t>[</m:t>
+        </m:r>
+        <m:sSub>
+          <m:sSubPr/>
+          <m:e>
+            <m:r>
+              <m:t>μ</m:t>
+            </m:r>
+          </m:e>
+          <m:sub>
+            <m:r>
+              <m:t>k</m:t>
+            </m:r>
+          </m:sub>
+        </m:sSub>
+        <m:r>
+          <m:t> − w, </m:t>
+        </m:r>
+        <m:sSub>
+          <m:sSubPr/>
+          <m:e>
+            <m:r>
+              <m:t>μ</m:t>
+            </m:r>
+          </m:e>
+          <m:sub>
+            <m:r>
+              <m:t>k</m:t>
+            </m:r>
+          </m:sub>
+        </m:sSub>
+        <m:r>
+          <m:t> + w],   w = clamp(3</m:t>
+        </m:r>
+        <m:sSub>
+          <m:sSubPr/>
+          <m:e>
+            <m:r>
+              <m:t>σ</m:t>
+            </m:r>
+          </m:e>
+          <m:sub>
+            <m:r>
+              <m:t>k</m:t>
+            </m:r>
+          </m:sub>
+        </m:sSub>
+        <m:r>
+          <m:t>, </m:t>
+        </m:r>
+        <m:sSub>
+          <m:sSubPr/>
+          <m:e>
+            <m:r>
+              <m:t>w</m:t>
+            </m:r>
+          </m:e>
+          <m:sub>
+            <m:r>
+              <m:t>min</m:t>
+            </m:r>
+          </m:sub>
+        </m:sSub>
+        <m:r>
+          <m:t>, </m:t>
+        </m:r>
+        <m:sSub>
+          <m:sSubPr/>
+          <m:e>
+            <m:r>
+              <m:t>w</m:t>
+            </m:r>
+          </m:e>
+          <m:sub>
+            <m:r>
+              <m:t>max</m:t>
+            </m:r>
+          </m:sub>
+        </m:sSub>
+        <m:r>
+          <m:t>)</m:t>
+        </m:r>
+      </m:oMath>
+    </w:p>
+    <w:p>
+      <w:pPr>
+        <w:spacing w:after="0" w:before="0" w:line="440" w:lineRule="exact"/>
+        <w:ind w:firstLine="480"/>
+      </w:pPr>
+      <w:r>
+        <w:rPr>
+          <w:rFonts w:ascii="Times New Roman" w:eastAsia="SimSun" w:hAnsi="Times New Roman"/>
+          <w:sz w:val="24"/>
+          <w:szCs w:val="24"/>
+        </w:rPr>
+        <w:t xml:space="preserve">温度取 w ∈ [1.5, 5.0] °C，湿度取 w ∈ [5, 15] %RH。</w:t>
       </w:r>
     </w:p>
     <w:p>
@@ -1254,17 +1463,14 @@
     </w:p>
     <w:p>
       <w:pPr>
-        <w:spacing w:after="60" w:before="60" w:line="240" w:lineRule="exact"/>
-        <w:ind w:left="240"/>
-      </w:pPr>
-      <w:r>
-        <w:rPr>
-          <w:rFonts w:ascii="Consolas" w:eastAsia="SimSun" w:hAnsi="Consolas"/>
-          <w:sz w:val="18"/>
-          <w:szCs w:val="18"/>
-        </w:rPr>
-        <w:t xml:space="preserve">[ max( μ - w , L + g ) ,  min( μ + w , U - g ) ]</w:t>
-      </w:r>
+        <w:spacing w:after="60" w:before="60" w:line="440" w:lineRule="exact"/>
+        <w:jc w:val="center"/>
+      </w:pPr>
+      <m:oMath>
+        <m:r>
+          <m:t>[max(μ − w, L + g),  min(μ + w, U − g)]</m:t>
+        </m:r>
+      </m:oMath>
     </w:p>
     <w:p>
       <w:pPr>
@@ -1398,17 +1604,84 @@
     </w:p>
     <w:p>
       <w:pPr>
-        <w:spacing w:after="60" w:before="60" w:line="240" w:lineRule="exact"/>
-        <w:ind w:left="240"/>
-      </w:pPr>
-      <w:r>
-        <w:rPr>
-          <w:rFonts w:ascii="Consolas" w:eastAsia="SimSun" w:hAnsi="Consolas"/>
-          <w:sz w:val="18"/>
-          <w:szCs w:val="18"/>
-        </w:rPr>
-        <w:t xml:space="preserve">v = [ x(n-1) - x(0) ] / [ ( t(n-1) - t(0) ) / 60 ]</w:t>
-      </w:r>
+        <w:spacing w:after="60" w:before="60" w:line="440" w:lineRule="exact"/>
+        <w:jc w:val="center"/>
+      </w:pPr>
+      <m:oMath>
+        <m:r>
+          <m:t>v = </m:t>
+        </m:r>
+        <m:f>
+          <m:num>
+            <m:r>
+              <m:t>60(</m:t>
+            </m:r>
+            <m:sSub>
+              <m:sSubPr/>
+              <m:e>
+                <m:r>
+                  <m:t>x</m:t>
+                </m:r>
+              </m:e>
+              <m:sub>
+                <m:r>
+                  <m:t>n−1</m:t>
+                </m:r>
+              </m:sub>
+            </m:sSub>
+            <m:r>
+              <m:t> − </m:t>
+            </m:r>
+            <m:sSub>
+              <m:sSubPr/>
+              <m:e>
+                <m:r>
+                  <m:t>x</m:t>
+                </m:r>
+              </m:e>
+              <m:sub>
+                <m:r>
+                  <m:t>0</m:t>
+                </m:r>
+              </m:sub>
+            </m:sSub>
+            <m:r>
+              <m:t>)</m:t>
+            </m:r>
+          </m:num>
+          <m:den>
+            <m:sSub>
+              <m:sSubPr/>
+              <m:e>
+                <m:r>
+                  <m:t>t</m:t>
+                </m:r>
+              </m:e>
+              <m:sub>
+                <m:r>
+                  <m:t>n−1</m:t>
+                </m:r>
+              </m:sub>
+            </m:sSub>
+            <m:r>
+              <m:t> − </m:t>
+            </m:r>
+            <m:sSub>
+              <m:sSubPr/>
+              <m:e>
+                <m:r>
+                  <m:t>t</m:t>
+                </m:r>
+              </m:e>
+              <m:sub>
+                <m:r>
+                  <m:t>0</m:t>
+                </m:r>
+              </m:sub>
+            </m:sSub>
+          </m:den>
+        </m:f>
+      </m:oMath>
     </w:p>
     <w:p>
       <w:pPr>
@@ -1451,7 +1724,77 @@
           <w:sz w:val="24"/>
           <w:szCs w:val="24"/>
         </w:rPr>
-        <w:t xml:space="preserve">告警判据在 1 Hz 安全任务内求值，该任务在网络初始化之前创建。最坏时延为 t(max) = T(sample) + t(GPIO) ≈ 1 s。若将求值置于主循环，则须等待 setup() 中 Wi-Fi（超时 20 s）、NTP、MQTT 全部完成，最坏时延超过 30 s。二者差异已实测验证（4.3 节）。</w:t>
+        <w:t xml:space="preserve">告警判据在 1 Hz 安全任务内求值，该任务在网络初始化之前创建，最坏时延为：</w:t>
+      </w:r>
+    </w:p>
+    <w:p>
+      <w:pPr>
+        <w:spacing w:after="60" w:before="60" w:line="440" w:lineRule="exact"/>
+        <w:jc w:val="center"/>
+      </w:pPr>
+      <m:oMath>
+        <m:sSub>
+          <m:sSubPr/>
+          <m:e>
+            <m:r>
+              <m:t>t</m:t>
+            </m:r>
+          </m:e>
+          <m:sub>
+            <m:r>
+              <m:t>max</m:t>
+            </m:r>
+          </m:sub>
+        </m:sSub>
+        <m:r>
+          <m:t> = </m:t>
+        </m:r>
+        <m:sSub>
+          <m:sSubPr/>
+          <m:e>
+            <m:r>
+              <m:t>T</m:t>
+            </m:r>
+          </m:e>
+          <m:sub>
+            <m:r>
+              <m:t>sample</m:t>
+            </m:r>
+          </m:sub>
+        </m:sSub>
+        <m:r>
+          <m:t> + </m:t>
+        </m:r>
+        <m:sSub>
+          <m:sSubPr/>
+          <m:e>
+            <m:r>
+              <m:t>t</m:t>
+            </m:r>
+          </m:e>
+          <m:sub>
+            <m:r>
+              <m:t>GPIO</m:t>
+            </m:r>
+          </m:sub>
+        </m:sSub>
+        <m:r>
+          <m:t> ≈ 1 s</m:t>
+        </m:r>
+      </m:oMath>
+    </w:p>
+    <w:p>
+      <w:pPr>
+        <w:spacing w:after="0" w:before="0" w:line="440" w:lineRule="exact"/>
+        <w:ind w:firstLine="480"/>
+      </w:pPr>
+      <w:r>
+        <w:rPr>
+          <w:rFonts w:ascii="Times New Roman" w:eastAsia="SimSun" w:hAnsi="Times New Roman"/>
+          <w:sz w:val="24"/>
+          <w:szCs w:val="24"/>
+        </w:rPr>
+        <w:t xml:space="preserve">若将求值置于主循环，则须等待 setup() 中 Wi-Fi（超时 20 s）、NTP、MQTT 全部完成，最坏时延超过 30 s。二者差异已实测验证（4.3 节）。</w:t>
       </w:r>
     </w:p>
     <w:p>

</xml_diff>

<commit_message>
Draw the system block diagram and place it in section 1.3
The architecture figure was an ASCII sketch. Replace it with a real
block diagram: sensing, the on-chip decision domain with its four
periodic tasks, the actuation layer, and the reporting layer, split by
an explicit network boundary that shows what keeps working when the
right-hand side is gone.

Fonts are sized so the smallest labels stay legible at the 16 cm text
width; the PNG is rendered at 3x for print.
</commit_message>
<xml_diff>
--- a/docs/设计报告.docx
+++ b/docs/设计报告.docx
@@ -898,184 +898,76 @@
     </w:p>
     <w:p>
       <w:pPr>
-        <w:spacing w:after="0" w:before="60" w:line="240" w:lineRule="exact"/>
-        <w:ind w:left="240"/>
-      </w:pPr>
-      <w:r>
-        <w:rPr>
-          <w:rFonts w:ascii="Consolas" w:eastAsia="SimSun" w:hAnsi="Consolas"/>
-          <w:sz w:val="18"/>
-          <w:szCs w:val="18"/>
-        </w:rPr>
-        <w:t xml:space="preserve">        +--------------------------------------------+</w:t>
-      </w:r>
-    </w:p>
-    <w:p>
-      <w:pPr>
-        <w:spacing w:after="0" w:before="0" w:line="240" w:lineRule="exact"/>
-        <w:ind w:left="240"/>
-      </w:pPr>
-      <w:r>
-        <w:rPr>
-          <w:rFonts w:ascii="Consolas" w:eastAsia="SimSun" w:hAnsi="Consolas"/>
-          <w:sz w:val="18"/>
-          <w:szCs w:val="18"/>
-        </w:rPr>
-        <w:t xml:space="preserve">        |  ESP32-S3                  [唯一判决层]     |</w:t>
-      </w:r>
-    </w:p>
-    <w:p>
-      <w:pPr>
-        <w:spacing w:after="0" w:before="0" w:line="240" w:lineRule="exact"/>
-        <w:ind w:left="240"/>
-      </w:pPr>
-      <w:r>
-        <w:rPr>
-          <w:rFonts w:ascii="Consolas" w:eastAsia="SimSun" w:hAnsi="Consolas"/>
-          <w:sz w:val="18"/>
-          <w:szCs w:val="18"/>
-        </w:rPr>
-        <w:t xml:space="preserve"> SHT30-&gt;|  1 Hz 安全任务: 物理有效性 + 硬限 + 告警阈值 |</w:t>
-      </w:r>
-    </w:p>
-    <w:p>
-      <w:pPr>
-        <w:spacing w:after="0" w:before="0" w:line="240" w:lineRule="exact"/>
-        <w:ind w:left="240"/>
-      </w:pPr>
-      <w:r>
-        <w:rPr>
-          <w:rFonts w:ascii="Consolas" w:eastAsia="SimSun" w:hAnsi="Consolas"/>
-          <w:sz w:val="18"/>
-          <w:szCs w:val="18"/>
-        </w:rPr>
-        <w:t xml:space="preserve">        |  中值滤波 -&gt; AdaptiveBaseline (学习正常范围) |</w:t>
-      </w:r>
-    </w:p>
-    <w:p>
-      <w:pPr>
-        <w:spacing w:after="0" w:before="0" w:line="240" w:lineRule="exact"/>
-        <w:ind w:left="240"/>
-      </w:pPr>
-      <w:r>
-        <w:rPr>
-          <w:rFonts w:ascii="Consolas" w:eastAsia="SimSun" w:hAnsi="Consolas"/>
-          <w:sz w:val="18"/>
-          <w:szCs w:val="18"/>
-        </w:rPr>
-        <w:t xml:space="preserve">        |           -&gt; EdgeReasoner (阈值 + 趋势速率)  |</w:t>
-      </w:r>
-    </w:p>
-    <w:p>
-      <w:pPr>
-        <w:spacing w:after="0" w:before="0" w:line="240" w:lineRule="exact"/>
-        <w:ind w:left="240"/>
-      </w:pPr>
-      <w:r>
-        <w:rPr>
-          <w:rFonts w:ascii="Consolas" w:eastAsia="SimSun" w:hAnsi="Consolas"/>
-          <w:sz w:val="18"/>
-          <w:szCs w:val="18"/>
-        </w:rPr>
-        <w:t xml:space="preserve">        |  =&gt; EdgeAssessment {状态,严重度,置信度,原因} |</w:t>
-      </w:r>
-    </w:p>
-    <w:p>
-      <w:pPr>
-        <w:spacing w:after="0" w:before="0" w:line="240" w:lineRule="exact"/>
-        <w:ind w:left="240"/>
-      </w:pPr>
-      <w:r>
-        <w:rPr>
-          <w:rFonts w:ascii="Consolas" w:eastAsia="SimSun" w:hAnsi="Consolas"/>
-          <w:sz w:val="18"/>
-          <w:szCs w:val="18"/>
-        </w:rPr>
-        <w:t xml:space="preserve">        +---+-------------+--------------+------------+</w:t>
-      </w:r>
-    </w:p>
-    <w:p>
-      <w:pPr>
-        <w:spacing w:after="0" w:before="0" w:line="240" w:lineRule="exact"/>
-        <w:ind w:left="240"/>
-      </w:pPr>
-      <w:r>
-        <w:rPr>
-          <w:rFonts w:ascii="Consolas" w:eastAsia="SimSun" w:hAnsi="Consolas"/>
-          <w:sz w:val="18"/>
-          <w:szCs w:val="18"/>
-        </w:rPr>
-        <w:t xml:space="preserve">            |             |              |</w:t>
-      </w:r>
-    </w:p>
-    <w:p>
-      <w:pPr>
-        <w:spacing w:after="0" w:before="0" w:line="240" w:lineRule="exact"/>
-        <w:ind w:left="240"/>
-      </w:pPr>
-      <w:r>
-        <w:rPr>
-          <w:rFonts w:ascii="Consolas" w:eastAsia="SimSun" w:hAnsi="Consolas"/>
-          <w:sz w:val="18"/>
-          <w:szCs w:val="18"/>
-        </w:rPr>
-        <w:t xml:space="preserve">     +------v-----+ +-----v------+ +-----v----------+</w:t>
-      </w:r>
-    </w:p>
-    <w:p>
-      <w:pPr>
-        <w:spacing w:after="0" w:before="0" w:line="240" w:lineRule="exact"/>
-        <w:ind w:left="240"/>
-      </w:pPr>
-      <w:r>
-        <w:rPr>
-          <w:rFonts w:ascii="Consolas" w:eastAsia="SimSun" w:hAnsi="Consolas"/>
-          <w:sz w:val="18"/>
-          <w:szCs w:val="18"/>
-        </w:rPr>
-        <w:t xml:space="preserve">     | 蜂鸣器+OLED| |   IoTDA    | | 本地服务        |</w:t>
-      </w:r>
-    </w:p>
-    <w:p>
-      <w:pPr>
-        <w:spacing w:after="0" w:before="0" w:line="240" w:lineRule="exact"/>
-        <w:ind w:left="240"/>
-      </w:pPr>
-      <w:r>
-        <w:rPr>
-          <w:rFonts w:ascii="Consolas" w:eastAsia="SimSun" w:hAnsi="Consolas"/>
-          <w:sz w:val="18"/>
-          <w:szCs w:val="18"/>
-        </w:rPr>
-        <w:t xml:space="preserve">     | &lt;1s 无网络 | |   MQTTS    | | SQLite + IQR   |</w:t>
-      </w:r>
-    </w:p>
-    <w:p>
-      <w:pPr>
-        <w:spacing w:after="0" w:before="0" w:line="240" w:lineRule="exact"/>
-        <w:ind w:left="240"/>
-      </w:pPr>
-      <w:r>
-        <w:rPr>
-          <w:rFonts w:ascii="Consolas" w:eastAsia="SimSun" w:hAnsi="Consolas"/>
-          <w:sz w:val="18"/>
-          <w:szCs w:val="18"/>
-        </w:rPr>
-        <w:t xml:space="preserve">     +------------+ +------------+ +----------------+</w:t>
-      </w:r>
-    </w:p>
-    <w:p>
-      <w:pPr>
-        <w:spacing w:after="60" w:before="0" w:line="240" w:lineRule="exact"/>
-        <w:ind w:left="240"/>
-      </w:pPr>
-      <w:r>
-        <w:rPr>
-          <w:rFonts w:ascii="Consolas" w:eastAsia="SimSun" w:hAnsi="Consolas"/>
-          <w:sz w:val="18"/>
-          <w:szCs w:val="18"/>
-        </w:rPr>
-        <w:t xml:space="preserve">      [告警出口]      [云端记录]     [记录/验证夹具]</w:t>
+        <w:spacing w:after="0" w:before="0" w:line="440" w:lineRule="exact"/>
+        <w:ind w:firstLine="480"/>
+      </w:pPr>
+      <w:r>
+        <w:rPr>
+          <w:rFonts w:ascii="Times New Roman" w:eastAsia="SimSun" w:hAnsi="Times New Roman"/>
+          <w:sz w:val="24"/>
+          <w:szCs w:val="24"/>
+        </w:rPr>
+        <w:t xml:space="preserve">系统总体结构如图 1 所示。虚线框内为 ESP32-S3 片上决策域，采样、滤波、基线学习、限值判定与告警输出全部在框内闭环；虚线框右侧的云平台与本地服务只接收框内已经得出的结论，不参与任何判定。</w:t>
+      </w:r>
+    </w:p>
+    <w:p>
+      <w:pPr>
+        <w:spacing w:after="60" w:before="120" w:line="240" w:lineRule="auto"/>
+        <w:jc w:val="center"/>
+      </w:pPr>
+      <w:r>
+        <w:drawing>
+          <wp:inline distT="0" distB="0" distL="0" distR="0">
+            <wp:extent cx="5762625" cy="4743450"/>
+            <wp:effectExtent t="0" r="0" b="0" l="0"/>
+            <wp:docPr id="1" name="" descr="" title=""/>
+            <wp:cNvGraphicFramePr>
+              <a:graphicFrameLocks xmlns:a="http://schemas.openxmlformats.org/drawingml/2006/main" noChangeAspect="1"/>
+            </wp:cNvGraphicFramePr>
+            <a:graphic xmlns:a="http://schemas.openxmlformats.org/drawingml/2006/main">
+              <a:graphicData uri="http://schemas.openxmlformats.org/drawingml/2006/picture">
+                <pic:pic xmlns:pic="http://schemas.openxmlformats.org/drawingml/2006/picture">
+                  <pic:nvPicPr>
+                    <pic:cNvPr id="0" name="" descr=""/>
+                    <pic:cNvPicPr>
+                      <a:picLocks noChangeAspect="1" noChangeArrowheads="1"/>
+                    </pic:cNvPicPr>
+                  </pic:nvPicPr>
+                  <pic:blipFill>
+                    <a:blip r:embed="rId8" cstate="none"/>
+                    <a:srcRect/>
+                    <a:stretch>
+                      <a:fillRect/>
+                    </a:stretch>
+                  </pic:blipFill>
+                  <pic:spPr bwMode="auto">
+                    <a:xfrm>
+                      <a:off x="0" y="0"/>
+                      <a:ext cx="5762625" cy="4743450"/>
+                    </a:xfrm>
+                    <a:prstGeom prst="rect">
+                      <a:avLst/>
+                    </a:prstGeom>
+                  </pic:spPr>
+                </pic:pic>
+              </a:graphicData>
+            </a:graphic>
+          </wp:inline>
+        </w:drawing>
+      </w:r>
+    </w:p>
+    <w:p>
+      <w:pPr>
+        <w:spacing w:after="120" w:before="0" w:line="440" w:lineRule="exact"/>
+        <w:jc w:val="center"/>
+      </w:pPr>
+      <w:r>
+        <w:rPr>
+          <w:rFonts w:ascii="Times New Roman" w:eastAsia="SimSun" w:hAnsi="Times New Roman"/>
+          <w:sz w:val="21"/>
+          <w:szCs w:val="21"/>
+        </w:rPr>
+        <w:t xml:space="preserve">图 1  系统总体方框图</w:t>
       </w:r>
     </w:p>
     <w:p>

</xml_diff>

<commit_message>
Give equation paragraphs auto line spacing so tall fractions fit
The formula paragraphs inherited the 22pt exact line spacing used for
body text. A fraction is taller than one line, so its denominator was
clipped. Switch equation paragraphs to auto line spacing and widen the
before/after gaps now that they no longer sit on a fixed grid.
</commit_message>
<xml_diff>
--- a/docs/设计报告.docx
+++ b/docs/设计报告.docx
@@ -1032,7 +1032,7 @@
     </w:p>
     <w:p>
       <w:pPr>
-        <w:spacing w:after="60" w:before="60" w:line="440" w:lineRule="exact"/>
+        <w:spacing w:after="120" w:before="120" w:line="440" w:lineRule="auto"/>
         <w:jc w:val="center"/>
       </w:pPr>
       <m:oMath>
@@ -1104,7 +1104,7 @@
     </w:p>
     <w:p>
       <w:pPr>
-        <w:spacing w:after="60" w:before="60" w:line="440" w:lineRule="exact"/>
+        <w:spacing w:after="120" w:before="120" w:line="440" w:lineRule="auto"/>
         <w:jc w:val="center"/>
       </w:pPr>
       <m:oMath>
@@ -1206,7 +1206,7 @@
     </w:p>
     <w:p>
       <w:pPr>
-        <w:spacing w:after="60" w:before="60" w:line="440" w:lineRule="exact"/>
+        <w:spacing w:after="120" w:before="120" w:line="440" w:lineRule="auto"/>
         <w:jc w:val="center"/>
       </w:pPr>
       <m:oMath>
@@ -1355,7 +1355,7 @@
     </w:p>
     <w:p>
       <w:pPr>
-        <w:spacing w:after="60" w:before="60" w:line="440" w:lineRule="exact"/>
+        <w:spacing w:after="120" w:before="120" w:line="440" w:lineRule="auto"/>
         <w:jc w:val="center"/>
       </w:pPr>
       <m:oMath>
@@ -1496,7 +1496,7 @@
     </w:p>
     <w:p>
       <w:pPr>
-        <w:spacing w:after="60" w:before="60" w:line="440" w:lineRule="exact"/>
+        <w:spacing w:after="120" w:before="120" w:line="440" w:lineRule="auto"/>
         <w:jc w:val="center"/>
       </w:pPr>
       <m:oMath>
@@ -1621,7 +1621,7 @@
     </w:p>
     <w:p>
       <w:pPr>
-        <w:spacing w:after="60" w:before="60" w:line="440" w:lineRule="exact"/>
+        <w:spacing w:after="120" w:before="120" w:line="440" w:lineRule="auto"/>
         <w:jc w:val="center"/>
       </w:pPr>
       <m:oMath>

</xml_diff>